<commit_message>
update results of testing IP3
</commit_message>
<xml_diff>
--- a/Documentation/Evaluation3/Results of testing_IP3.docx
+++ b/Documentation/Evaluation3/Results of testing_IP3.docx
@@ -20,7 +20,27 @@
           <w:sz w:val="28"/>
           <w:szCs w:val="28"/>
         </w:rPr>
-        <w:t>IP2 Testing Results</w:t>
+        <w:t>IP</w:t>
+      </w:r>
+      <w:r>
+        <w:rPr>
+          <w:rFonts w:ascii="Aptos" w:hAnsi="Aptos"/>
+          <w:b/>
+          <w:bCs/>
+          <w:sz w:val="28"/>
+          <w:szCs w:val="28"/>
+        </w:rPr>
+        <w:t>3</w:t>
+      </w:r>
+      <w:r>
+        <w:rPr>
+          <w:rFonts w:ascii="Aptos" w:hAnsi="Aptos"/>
+          <w:b/>
+          <w:bCs/>
+          <w:sz w:val="28"/>
+          <w:szCs w:val="28"/>
+        </w:rPr>
+        <w:t xml:space="preserve"> Testing Results</w:t>
       </w:r>
     </w:p>
     <w:p>
@@ -79,26 +99,14 @@
         <w:rPr>
           <w:rFonts w:ascii="Aptos" w:hAnsi="Aptos"/>
         </w:rPr>
-        <w:t xml:space="preserve">(Task </w:t>
-      </w:r>
-      <w:r>
-        <w:rPr>
-          <w:rFonts w:ascii="Aptos" w:hAnsi="Aptos"/>
-        </w:rPr>
-        <w:t xml:space="preserve">1) </w:t>
+        <w:t xml:space="preserve">(Task 1) </w:t>
       </w:r>
       <w:bookmarkEnd w:id="2"/>
       <w:r>
         <w:rPr>
           <w:rFonts w:ascii="Aptos" w:hAnsi="Aptos"/>
         </w:rPr>
-        <w:t>Draw</w:t>
-      </w:r>
-      <w:r>
-        <w:rPr>
-          <w:rFonts w:ascii="Aptos" w:hAnsi="Aptos"/>
-        </w:rPr>
-        <w:t xml:space="preserve"> with Red Pen</w:t>
+        <w:t>Draw with Red Pen</w:t>
       </w:r>
     </w:p>
     <w:p>
@@ -142,7 +150,20 @@
         <w:rPr>
           <w:rFonts w:ascii="Aptos" w:hAnsi="Aptos"/>
         </w:rPr>
-        <w:t xml:space="preserve"> to activate the red pen and draw. </w:t>
+        <w:t xml:space="preserve"> to activate the </w:t>
+      </w:r>
+      <w:r>
+        <w:rPr>
+          <w:rFonts w:ascii="Aptos" w:hAnsi="Aptos"/>
+          <w:color w:val="C0504D" w:themeColor="accent2"/>
+        </w:rPr>
+        <w:t>red</w:t>
+      </w:r>
+      <w:r>
+        <w:rPr>
+          <w:rFonts w:ascii="Aptos" w:hAnsi="Aptos"/>
+        </w:rPr>
+        <w:t xml:space="preserve"> pen and draw. </w:t>
       </w:r>
       <w:bookmarkStart w:id="3" w:name="OLE_LINK9"/>
       <w:r>
@@ -169,19 +190,7 @@
         <w:rPr>
           <w:rFonts w:ascii="Aptos" w:hAnsi="Aptos"/>
         </w:rPr>
-        <w:t xml:space="preserve">(Task </w:t>
-      </w:r>
-      <w:r>
-        <w:rPr>
-          <w:rFonts w:ascii="Aptos" w:hAnsi="Aptos"/>
-        </w:rPr>
-        <w:t>2</w:t>
-      </w:r>
-      <w:r>
-        <w:rPr>
-          <w:rFonts w:ascii="Aptos" w:hAnsi="Aptos"/>
-        </w:rPr>
-        <w:t xml:space="preserve">) </w:t>
+        <w:t xml:space="preserve">(Task 2) </w:t>
       </w:r>
       <w:bookmarkEnd w:id="4"/>
       <w:r>
@@ -210,53 +219,26 @@
           <w:b/>
           <w:bCs/>
         </w:rPr>
-        <w:t>L</w:t>
-      </w:r>
-      <w:r>
-        <w:rPr>
-          <w:rFonts w:ascii="Aptos" w:hAnsi="Aptos"/>
-          <w:b/>
-          <w:bCs/>
-        </w:rPr>
-        <w:t>-</w:t>
-      </w:r>
-      <w:r>
-        <w:rPr>
-          <w:rFonts w:ascii="Aptos" w:hAnsi="Aptos"/>
-          <w:b/>
-          <w:bCs/>
-        </w:rPr>
-        <w:t>Shape pose</w:t>
+        <w:t>L-Shape pose</w:t>
       </w:r>
       <w:r>
         <w:rPr>
           <w:rFonts w:ascii="Aptos" w:hAnsi="Aptos"/>
         </w:rPr>
-        <w:t xml:space="preserve"> to </w:t>
+        <w:t xml:space="preserve"> to switch to the </w:t>
+      </w:r>
+      <w:r>
+        <w:rPr>
+          <w:rFonts w:ascii="Aptos" w:hAnsi="Aptos"/>
+          <w:color w:val="9BBB59" w:themeColor="accent3"/>
+        </w:rPr>
+        <w:t>green</w:t>
       </w:r>
       <w:r>
         <w:rPr>
           <w:rFonts w:ascii="Aptos" w:hAnsi="Aptos"/>
         </w:rPr>
-        <w:t>switch</w:t>
-      </w:r>
-      <w:r>
-        <w:rPr>
-          <w:rFonts w:ascii="Aptos" w:hAnsi="Aptos"/>
-        </w:rPr>
-        <w:t xml:space="preserve"> to the green pen and </w:t>
-      </w:r>
-      <w:r>
-        <w:rPr>
-          <w:rFonts w:ascii="Aptos" w:hAnsi="Aptos"/>
-        </w:rPr>
-        <w:t>begin drawing</w:t>
-      </w:r>
-      <w:r>
-        <w:rPr>
-          <w:rFonts w:ascii="Aptos" w:hAnsi="Aptos"/>
-        </w:rPr>
-        <w:t>. Relax the left hand if you want to stop drawing and prevent unintended strokes.</w:t>
+        <w:t xml:space="preserve"> pen and begin drawing. Relax the left hand if you want to stop drawing and prevent unintended strokes.</w:t>
       </w:r>
     </w:p>
     <w:p>
@@ -275,19 +257,7 @@
         <w:rPr>
           <w:rFonts w:ascii="Aptos" w:hAnsi="Aptos"/>
         </w:rPr>
-        <w:t xml:space="preserve">(Task </w:t>
-      </w:r>
-      <w:r>
-        <w:rPr>
-          <w:rFonts w:ascii="Aptos" w:hAnsi="Aptos"/>
-        </w:rPr>
-        <w:t>3</w:t>
-      </w:r>
-      <w:r>
-        <w:rPr>
-          <w:rFonts w:ascii="Aptos" w:hAnsi="Aptos"/>
-        </w:rPr>
-        <w:t xml:space="preserve">) </w:t>
+        <w:t xml:space="preserve">(Task 3) </w:t>
       </w:r>
       <w:bookmarkEnd w:id="5"/>
       <w:r>
@@ -322,7 +292,20 @@
         <w:rPr>
           <w:rFonts w:ascii="Aptos" w:hAnsi="Aptos"/>
         </w:rPr>
-        <w:t xml:space="preserve"> to enable the eraser and remove part of the drawing.</w:t>
+        <w:t xml:space="preserve"> to enable the </w:t>
+      </w:r>
+      <w:r>
+        <w:rPr>
+          <w:rFonts w:ascii="Aptos" w:hAnsi="Aptos"/>
+          <w:color w:val="1F497D" w:themeColor="text2"/>
+        </w:rPr>
+        <w:t>eraser</w:t>
+      </w:r>
+      <w:r>
+        <w:rPr>
+          <w:rFonts w:ascii="Aptos" w:hAnsi="Aptos"/>
+        </w:rPr>
+        <w:t xml:space="preserve"> and remove part of the drawing.</w:t>
       </w:r>
     </w:p>
     <w:p>
@@ -340,19 +323,7 @@
         <w:rPr>
           <w:rFonts w:ascii="Aptos" w:hAnsi="Aptos"/>
         </w:rPr>
-        <w:t xml:space="preserve">(Task </w:t>
-      </w:r>
-      <w:r>
-        <w:rPr>
-          <w:rFonts w:ascii="Aptos" w:hAnsi="Aptos"/>
-        </w:rPr>
-        <w:t>4</w:t>
-      </w:r>
-      <w:r>
-        <w:rPr>
-          <w:rFonts w:ascii="Aptos" w:hAnsi="Aptos"/>
-        </w:rPr>
-        <w:t xml:space="preserve">) Use </w:t>
+        <w:t xml:space="preserve">(Task 4) Use </w:t>
       </w:r>
       <w:r>
         <w:rPr>
@@ -384,19 +355,7 @@
         <w:rPr>
           <w:rFonts w:ascii="Aptos" w:hAnsi="Aptos"/>
         </w:rPr>
-        <w:t>Encourage participants to switch between tools and draw</w:t>
-      </w:r>
-      <w:r>
-        <w:rPr>
-          <w:rFonts w:ascii="Aptos" w:hAnsi="Aptos"/>
-        </w:rPr>
-        <w:t xml:space="preserve"> freely</w:t>
-      </w:r>
-      <w:r>
-        <w:rPr>
-          <w:rFonts w:ascii="Aptos" w:hAnsi="Aptos"/>
-        </w:rPr>
-        <w:t>.</w:t>
+        <w:t>Encourage participants to switch between tools and draw freely.</w:t>
       </w:r>
       <w:bookmarkEnd w:id="0"/>
     </w:p>
@@ -504,10 +463,10 @@
       </w:tblPr>
       <w:tblGrid>
         <w:gridCol w:w="663"/>
-        <w:gridCol w:w="1423"/>
-        <w:gridCol w:w="1248"/>
+        <w:gridCol w:w="1422"/>
+        <w:gridCol w:w="1245"/>
         <w:gridCol w:w="1353"/>
-        <w:gridCol w:w="3943"/>
+        <w:gridCol w:w="3947"/>
       </w:tblGrid>
       <w:tr>
         <w:tc>
@@ -651,7 +610,6 @@
           </w:p>
         </w:tc>
       </w:tr>
-      <w:bookmarkEnd w:id="7"/>
       <w:tr>
         <w:tc>
           <w:tcPr>
@@ -664,6 +622,8 @@
                 <w:rFonts w:ascii="Aptos" w:hAnsi="Aptos"/>
               </w:rPr>
             </w:pPr>
+            <w:bookmarkStart w:id="8" w:name="_Hlk212203502"/>
+            <w:bookmarkEnd w:id="7"/>
             <w:r>
               <w:rPr>
                 <w:rFonts w:ascii="Aptos" w:hAnsi="Aptos"/>
@@ -682,6 +642,12 @@
                 <w:rFonts w:ascii="Aptos" w:hAnsi="Aptos"/>
               </w:rPr>
             </w:pPr>
+            <w:r>
+              <w:rPr>
+                <w:rFonts w:ascii="Aptos" w:hAnsi="Aptos"/>
+              </w:rPr>
+              <w:t>yes</w:t>
+            </w:r>
           </w:p>
         </w:tc>
         <w:tc>
@@ -694,6 +660,12 @@
                 <w:rFonts w:ascii="Aptos" w:hAnsi="Aptos"/>
               </w:rPr>
             </w:pPr>
+            <w:r>
+              <w:rPr>
+                <w:rFonts w:ascii="Aptos" w:hAnsi="Aptos"/>
+              </w:rPr>
+              <w:t>0</w:t>
+            </w:r>
           </w:p>
         </w:tc>
         <w:tc>
@@ -707,12 +679,174 @@
                 <w:rFonts w:ascii="Aptos" w:hAnsi="Aptos"/>
               </w:rPr>
             </w:pPr>
+            <w:r>
+              <w:rPr>
+                <w:rFonts w:ascii="Aptos" w:hAnsi="Aptos"/>
+              </w:rPr>
+              <w:t>4</w:t>
+            </w:r>
           </w:p>
         </w:tc>
         <w:tc>
           <w:tcPr>
             <w:tcW w:w="4190" w:type="dxa"/>
             <w:vMerge w:val="restart"/>
+          </w:tcPr>
+          <w:p>
+            <w:pPr>
+              <w:rPr>
+                <w:rFonts w:ascii="Aptos" w:hAnsi="Aptos"/>
+                <w:lang w:eastAsia="zh-CN"/>
+              </w:rPr>
+            </w:pPr>
+            <w:r>
+              <w:rPr>
+                <w:rFonts w:ascii="Aptos" w:hAnsi="Aptos"/>
+                <w:lang w:eastAsia="zh-CN"/>
+              </w:rPr>
+              <w:t>T</w:t>
+            </w:r>
+            <w:r>
+              <w:rPr>
+                <w:rFonts w:ascii="Aptos" w:hAnsi="Aptos" w:hint="eastAsia"/>
+                <w:lang w:eastAsia="zh-CN"/>
+              </w:rPr>
+              <w:t xml:space="preserve">he pen moving </w:t>
+            </w:r>
+            <w:r>
+              <w:rPr>
+                <w:rFonts w:ascii="Aptos" w:hAnsi="Aptos"/>
+                <w:lang w:eastAsia="zh-CN"/>
+              </w:rPr>
+              <w:t>super-fast</w:t>
+            </w:r>
+            <w:r>
+              <w:rPr>
+                <w:rFonts w:ascii="Aptos" w:hAnsi="Aptos" w:hint="eastAsia"/>
+                <w:lang w:eastAsia="zh-CN"/>
+              </w:rPr>
+              <w:t xml:space="preserve"> while drawing.</w:t>
+            </w:r>
+          </w:p>
+          <w:p>
+            <w:pPr>
+              <w:rPr>
+                <w:rFonts w:ascii="Aptos" w:hAnsi="Aptos"/>
+                <w:lang w:eastAsia="zh-CN"/>
+              </w:rPr>
+            </w:pPr>
+            <w:r>
+              <w:rPr>
+                <w:rFonts w:ascii="Aptos" w:hAnsi="Aptos"/>
+                <w:lang w:eastAsia="zh-CN"/>
+              </w:rPr>
+              <w:t>T</w:t>
+            </w:r>
+            <w:r>
+              <w:rPr>
+                <w:rFonts w:ascii="Aptos" w:hAnsi="Aptos" w:hint="eastAsia"/>
+                <w:lang w:eastAsia="zh-CN"/>
+              </w:rPr>
+              <w:t>he hand-gestures are hard to recall</w:t>
+            </w:r>
+            <w:r>
+              <w:rPr>
+                <w:rFonts w:ascii="Aptos" w:hAnsi="Aptos" w:hint="eastAsia"/>
+                <w:lang w:eastAsia="zh-CN"/>
+              </w:rPr>
+              <w:t>, maybe add some reminder?</w:t>
+            </w:r>
+            <w:r>
+              <w:rPr>
+                <w:rFonts w:ascii="Aptos" w:hAnsi="Aptos"/>
+                <w:lang w:eastAsia="zh-CN"/>
+              </w:rPr>
+              <w:br/>
+              <w:t>L</w:t>
+            </w:r>
+            <w:r>
+              <w:rPr>
+                <w:rFonts w:ascii="Aptos" w:hAnsi="Aptos" w:hint="eastAsia"/>
+                <w:lang w:eastAsia="zh-CN"/>
+              </w:rPr>
+              <w:t>eft hand gesture should stay still otherwise the tool will disappear.</w:t>
+            </w:r>
+          </w:p>
+        </w:tc>
+      </w:tr>
+      <w:tr>
+        <w:tc>
+          <w:tcPr>
+            <w:tcW w:w="664" w:type="dxa"/>
+          </w:tcPr>
+          <w:p>
+            <w:pPr>
+              <w:jc w:val="center"/>
+              <w:rPr>
+                <w:rFonts w:ascii="Aptos" w:hAnsi="Aptos"/>
+              </w:rPr>
+            </w:pPr>
+            <w:r>
+              <w:rPr>
+                <w:rFonts w:ascii="Aptos" w:hAnsi="Aptos"/>
+              </w:rPr>
+              <w:t>2</w:t>
+            </w:r>
+          </w:p>
+        </w:tc>
+        <w:tc>
+          <w:tcPr>
+            <w:tcW w:w="1429" w:type="dxa"/>
+          </w:tcPr>
+          <w:p>
+            <w:pPr>
+              <w:rPr>
+                <w:rFonts w:ascii="Aptos" w:hAnsi="Aptos"/>
+              </w:rPr>
+            </w:pPr>
+            <w:r>
+              <w:rPr>
+                <w:rFonts w:ascii="Aptos" w:hAnsi="Aptos"/>
+              </w:rPr>
+              <w:t>yes</w:t>
+            </w:r>
+          </w:p>
+        </w:tc>
+        <w:tc>
+          <w:tcPr>
+            <w:tcW w:w="1276" w:type="dxa"/>
+          </w:tcPr>
+          <w:p>
+            <w:pPr>
+              <w:rPr>
+                <w:rFonts w:ascii="Aptos" w:hAnsi="Aptos"/>
+              </w:rPr>
+            </w:pPr>
+            <w:r>
+              <w:rPr>
+                <w:rFonts w:ascii="Aptos" w:hAnsi="Aptos"/>
+              </w:rPr>
+              <w:t>0</w:t>
+            </w:r>
+          </w:p>
+        </w:tc>
+        <w:tc>
+          <w:tcPr>
+            <w:tcW w:w="1297" w:type="dxa"/>
+            <w:vMerge/>
+          </w:tcPr>
+          <w:p>
+            <w:pPr>
+              <w:rPr>
+                <w:rFonts w:ascii="Aptos" w:hAnsi="Aptos"/>
+              </w:rPr>
+            </w:pPr>
+          </w:p>
+        </w:tc>
+        <w:tc>
+          <w:tcPr>
+            <w:tcW w:w="4190" w:type="dxa"/>
+            <w:vMerge/>
           </w:tcPr>
           <w:p>
             <w:pPr>
@@ -739,7 +873,7 @@
               <w:rPr>
                 <w:rFonts w:ascii="Aptos" w:hAnsi="Aptos"/>
               </w:rPr>
-              <w:t>2</w:t>
+              <w:t>3</w:t>
             </w:r>
           </w:p>
         </w:tc>
@@ -753,6 +887,12 @@
                 <w:rFonts w:ascii="Aptos" w:hAnsi="Aptos"/>
               </w:rPr>
             </w:pPr>
+            <w:r>
+              <w:rPr>
+                <w:rFonts w:ascii="Aptos" w:hAnsi="Aptos"/>
+              </w:rPr>
+              <w:t>yes</w:t>
+            </w:r>
           </w:p>
         </w:tc>
         <w:tc>
@@ -765,6 +905,12 @@
                 <w:rFonts w:ascii="Aptos" w:hAnsi="Aptos"/>
               </w:rPr>
             </w:pPr>
+            <w:r>
+              <w:rPr>
+                <w:rFonts w:ascii="Aptos" w:hAnsi="Aptos"/>
+              </w:rPr>
+              <w:t>0</w:t>
+            </w:r>
           </w:p>
         </w:tc>
         <w:tc>
@@ -810,7 +956,7 @@
               <w:rPr>
                 <w:rFonts w:ascii="Aptos" w:hAnsi="Aptos"/>
               </w:rPr>
-              <w:t>3</w:t>
+              <w:t>4</w:t>
             </w:r>
           </w:p>
         </w:tc>
@@ -824,6 +970,12 @@
                 <w:rFonts w:ascii="Aptos" w:hAnsi="Aptos"/>
               </w:rPr>
             </w:pPr>
+            <w:r>
+              <w:rPr>
+                <w:rFonts w:ascii="Aptos" w:hAnsi="Aptos"/>
+              </w:rPr>
+              <w:t>yes</w:t>
+            </w:r>
           </w:p>
         </w:tc>
         <w:tc>
@@ -836,6 +988,12 @@
                 <w:rFonts w:ascii="Aptos" w:hAnsi="Aptos"/>
               </w:rPr>
             </w:pPr>
+            <w:r>
+              <w:rPr>
+                <w:rFonts w:ascii="Aptos" w:hAnsi="Aptos"/>
+              </w:rPr>
+              <w:t>0</w:t>
+            </w:r>
           </w:p>
         </w:tc>
         <w:tc>
@@ -865,78 +1023,8 @@
           </w:p>
         </w:tc>
       </w:tr>
-      <w:tr>
-        <w:tc>
-          <w:tcPr>
-            <w:tcW w:w="664" w:type="dxa"/>
-          </w:tcPr>
-          <w:p>
-            <w:pPr>
-              <w:jc w:val="center"/>
-              <w:rPr>
-                <w:rFonts w:ascii="Aptos" w:hAnsi="Aptos"/>
-              </w:rPr>
-            </w:pPr>
-            <w:r>
-              <w:rPr>
-                <w:rFonts w:ascii="Aptos" w:hAnsi="Aptos"/>
-              </w:rPr>
-              <w:t>4</w:t>
-            </w:r>
-          </w:p>
-        </w:tc>
-        <w:tc>
-          <w:tcPr>
-            <w:tcW w:w="1429" w:type="dxa"/>
-          </w:tcPr>
-          <w:p>
-            <w:pPr>
-              <w:rPr>
-                <w:rFonts w:ascii="Aptos" w:hAnsi="Aptos"/>
-              </w:rPr>
-            </w:pPr>
-          </w:p>
-        </w:tc>
-        <w:tc>
-          <w:tcPr>
-            <w:tcW w:w="1276" w:type="dxa"/>
-          </w:tcPr>
-          <w:p>
-            <w:pPr>
-              <w:rPr>
-                <w:rFonts w:ascii="Aptos" w:hAnsi="Aptos"/>
-              </w:rPr>
-            </w:pPr>
-          </w:p>
-        </w:tc>
-        <w:tc>
-          <w:tcPr>
-            <w:tcW w:w="1297" w:type="dxa"/>
-            <w:vMerge/>
-          </w:tcPr>
-          <w:p>
-            <w:pPr>
-              <w:rPr>
-                <w:rFonts w:ascii="Aptos" w:hAnsi="Aptos"/>
-              </w:rPr>
-            </w:pPr>
-          </w:p>
-        </w:tc>
-        <w:tc>
-          <w:tcPr>
-            <w:tcW w:w="4190" w:type="dxa"/>
-            <w:vMerge/>
-          </w:tcPr>
-          <w:p>
-            <w:pPr>
-              <w:rPr>
-                <w:rFonts w:ascii="Aptos" w:hAnsi="Aptos"/>
-              </w:rPr>
-            </w:pPr>
-          </w:p>
-        </w:tc>
-      </w:tr>
       <w:bookmarkEnd w:id="6"/>
+      <w:bookmarkEnd w:id="8"/>
     </w:tbl>
     <w:p>
       <w:pPr>
@@ -957,15 +1045,7 @@
           <w:b/>
           <w:bCs/>
         </w:rPr>
-        <w:t xml:space="preserve">Participant </w:t>
-      </w:r>
-      <w:r>
-        <w:rPr>
-          <w:rFonts w:ascii="Aptos" w:hAnsi="Aptos"/>
-          <w:b/>
-          <w:bCs/>
-        </w:rPr>
-        <w:t>2</w:t>
+        <w:t>Participant 2</w:t>
       </w:r>
     </w:p>
     <w:tbl>
@@ -984,7 +1064,7 @@
       <w:tr>
         <w:tc>
           <w:tcPr>
-            <w:tcW w:w="664" w:type="dxa"/>
+            <w:tcW w:w="663" w:type="dxa"/>
           </w:tcPr>
           <w:p>
             <w:pPr>
@@ -1005,7 +1085,7 @@
         </w:tc>
         <w:tc>
           <w:tcPr>
-            <w:tcW w:w="1428" w:type="dxa"/>
+            <w:tcW w:w="1422" w:type="dxa"/>
           </w:tcPr>
           <w:p>
             <w:pPr>
@@ -1024,7 +1104,7 @@
         </w:tc>
         <w:tc>
           <w:tcPr>
-            <w:tcW w:w="1275" w:type="dxa"/>
+            <w:tcW w:w="1249" w:type="dxa"/>
           </w:tcPr>
           <w:p>
             <w:pPr>
@@ -1057,7 +1137,7 @@
         </w:tc>
         <w:tc>
           <w:tcPr>
-            <w:tcW w:w="1309" w:type="dxa"/>
+            <w:tcW w:w="1353" w:type="dxa"/>
           </w:tcPr>
           <w:p>
             <w:pPr>
@@ -1090,7 +1170,7 @@
         </w:tc>
         <w:tc>
           <w:tcPr>
-            <w:tcW w:w="4180" w:type="dxa"/>
+            <w:tcW w:w="3943" w:type="dxa"/>
           </w:tcPr>
           <w:p>
             <w:pPr>
@@ -1125,7 +1205,7 @@
       <w:tr>
         <w:tc>
           <w:tcPr>
-            <w:tcW w:w="664" w:type="dxa"/>
+            <w:tcW w:w="663" w:type="dxa"/>
           </w:tcPr>
           <w:p>
             <w:pPr>
@@ -1134,6 +1214,7 @@
                 <w:rFonts w:ascii="Aptos" w:hAnsi="Aptos"/>
               </w:rPr>
             </w:pPr>
+            <w:bookmarkStart w:id="9" w:name="_Hlk212203790"/>
             <w:r>
               <w:rPr>
                 <w:rFonts w:ascii="Aptos" w:hAnsi="Aptos"/>
@@ -1144,7 +1225,7 @@
         </w:tc>
         <w:tc>
           <w:tcPr>
-            <w:tcW w:w="1428" w:type="dxa"/>
+            <w:tcW w:w="1422" w:type="dxa"/>
           </w:tcPr>
           <w:p>
             <w:pPr>
@@ -1152,11 +1233,17 @@
                 <w:rFonts w:ascii="Aptos" w:hAnsi="Aptos"/>
               </w:rPr>
             </w:pPr>
+            <w:r>
+              <w:rPr>
+                <w:rFonts w:ascii="Aptos" w:hAnsi="Aptos"/>
+              </w:rPr>
+              <w:t>yes</w:t>
+            </w:r>
           </w:p>
         </w:tc>
         <w:tc>
           <w:tcPr>
-            <w:tcW w:w="1275" w:type="dxa"/>
+            <w:tcW w:w="1249" w:type="dxa"/>
           </w:tcPr>
           <w:p>
             <w:pPr>
@@ -1164,11 +1251,17 @@
                 <w:rFonts w:ascii="Aptos" w:hAnsi="Aptos"/>
               </w:rPr>
             </w:pPr>
+            <w:r>
+              <w:rPr>
+                <w:rFonts w:ascii="Aptos" w:hAnsi="Aptos"/>
+              </w:rPr>
+              <w:t>0</w:t>
+            </w:r>
           </w:p>
         </w:tc>
         <w:tc>
           <w:tcPr>
-            <w:tcW w:w="1309" w:type="dxa"/>
+            <w:tcW w:w="1353" w:type="dxa"/>
             <w:vMerge w:val="restart"/>
           </w:tcPr>
           <w:p>
@@ -1177,12 +1270,17 @@
                 <w:rFonts w:ascii="Aptos" w:hAnsi="Aptos"/>
               </w:rPr>
             </w:pPr>
+            <w:r>
+              <w:rPr>
+                <w:rFonts w:ascii="Aptos" w:hAnsi="Aptos"/>
+              </w:rPr>
+              <w:t>4</w:t>
+            </w:r>
           </w:p>
         </w:tc>
         <w:tc>
           <w:tcPr>
-            <w:tcW w:w="4180" w:type="dxa"/>
-            <w:vMerge w:val="restart"/>
+            <w:tcW w:w="3943" w:type="dxa"/>
           </w:tcPr>
           <w:p>
             <w:pPr>
@@ -1190,13 +1288,19 @@
                 <w:rFonts w:ascii="Aptos" w:hAnsi="Aptos"/>
               </w:rPr>
             </w:pPr>
+            <w:r>
+              <w:rPr>
+                <w:rFonts w:ascii="Aptos" w:hAnsi="Aptos"/>
+              </w:rPr>
+              <w:t>The pen disappears, I don’t know where it is, this made me anxious</w:t>
+            </w:r>
           </w:p>
         </w:tc>
       </w:tr>
       <w:tr>
         <w:tc>
           <w:tcPr>
-            <w:tcW w:w="664" w:type="dxa"/>
+            <w:tcW w:w="663" w:type="dxa"/>
           </w:tcPr>
           <w:p>
             <w:pPr>
@@ -1209,13 +1313,51 @@
               <w:rPr>
                 <w:rFonts w:ascii="Aptos" w:hAnsi="Aptos"/>
               </w:rPr>
+              <w:lastRenderedPageBreak/>
               <w:t>2</w:t>
             </w:r>
           </w:p>
         </w:tc>
         <w:tc>
           <w:tcPr>
-            <w:tcW w:w="1428" w:type="dxa"/>
+            <w:tcW w:w="1422" w:type="dxa"/>
+          </w:tcPr>
+          <w:p>
+            <w:pPr>
+              <w:rPr>
+                <w:rFonts w:ascii="Aptos" w:hAnsi="Aptos"/>
+              </w:rPr>
+            </w:pPr>
+            <w:r>
+              <w:rPr>
+                <w:rFonts w:ascii="Aptos" w:hAnsi="Aptos"/>
+              </w:rPr>
+              <w:t>yes</w:t>
+            </w:r>
+          </w:p>
+        </w:tc>
+        <w:tc>
+          <w:tcPr>
+            <w:tcW w:w="1249" w:type="dxa"/>
+          </w:tcPr>
+          <w:p>
+            <w:pPr>
+              <w:rPr>
+                <w:rFonts w:ascii="Aptos" w:hAnsi="Aptos"/>
+              </w:rPr>
+            </w:pPr>
+            <w:r>
+              <w:rPr>
+                <w:rFonts w:ascii="Aptos" w:hAnsi="Aptos"/>
+              </w:rPr>
+              <w:t>1</w:t>
+            </w:r>
+          </w:p>
+        </w:tc>
+        <w:tc>
+          <w:tcPr>
+            <w:tcW w:w="1353" w:type="dxa"/>
+            <w:vMerge/>
           </w:tcPr>
           <w:p>
             <w:pPr>
@@ -1227,7 +1369,7 @@
         </w:tc>
         <w:tc>
           <w:tcPr>
-            <w:tcW w:w="1275" w:type="dxa"/>
+            <w:tcW w:w="3943" w:type="dxa"/>
           </w:tcPr>
           <w:p>
             <w:pPr>
@@ -1235,39 +1377,33 @@
                 <w:rFonts w:ascii="Aptos" w:hAnsi="Aptos"/>
               </w:rPr>
             </w:pPr>
-          </w:p>
-        </w:tc>
-        <w:tc>
-          <w:tcPr>
-            <w:tcW w:w="1309" w:type="dxa"/>
-            <w:vMerge/>
-          </w:tcPr>
-          <w:p>
-            <w:pPr>
-              <w:rPr>
-                <w:rFonts w:ascii="Aptos" w:hAnsi="Aptos"/>
-              </w:rPr>
-            </w:pPr>
-          </w:p>
-        </w:tc>
-        <w:tc>
-          <w:tcPr>
-            <w:tcW w:w="4180" w:type="dxa"/>
-            <w:vMerge/>
-          </w:tcPr>
-          <w:p>
-            <w:pPr>
-              <w:rPr>
-                <w:rFonts w:ascii="Aptos" w:hAnsi="Aptos"/>
-              </w:rPr>
-            </w:pPr>
+            <w:r>
+              <w:rPr>
+                <w:rFonts w:ascii="Aptos" w:hAnsi="Aptos"/>
+              </w:rPr>
+              <w:t xml:space="preserve">L shape pose is </w:t>
+            </w:r>
+            <w:bookmarkStart w:id="10" w:name="OLE_LINK11"/>
+            <w:r>
+              <w:rPr>
+                <w:rFonts w:ascii="Aptos" w:hAnsi="Aptos"/>
+              </w:rPr>
+              <w:t xml:space="preserve">a little bit difficult to </w:t>
+            </w:r>
+            <w:bookmarkEnd w:id="10"/>
+            <w:r>
+              <w:rPr>
+                <w:rFonts w:ascii="Aptos" w:hAnsi="Aptos"/>
+              </w:rPr>
+              <w:t>recognize</w:t>
+            </w:r>
           </w:p>
         </w:tc>
       </w:tr>
       <w:tr>
         <w:tc>
           <w:tcPr>
-            <w:tcW w:w="664" w:type="dxa"/>
+            <w:tcW w:w="663" w:type="dxa"/>
           </w:tcPr>
           <w:p>
             <w:pPr>
@@ -1286,7 +1422,44 @@
         </w:tc>
         <w:tc>
           <w:tcPr>
-            <w:tcW w:w="1428" w:type="dxa"/>
+            <w:tcW w:w="1422" w:type="dxa"/>
+          </w:tcPr>
+          <w:p>
+            <w:pPr>
+              <w:rPr>
+                <w:rFonts w:ascii="Aptos" w:hAnsi="Aptos"/>
+              </w:rPr>
+            </w:pPr>
+            <w:r>
+              <w:rPr>
+                <w:rFonts w:ascii="Aptos" w:hAnsi="Aptos"/>
+              </w:rPr>
+              <w:t>yes</w:t>
+            </w:r>
+          </w:p>
+        </w:tc>
+        <w:tc>
+          <w:tcPr>
+            <w:tcW w:w="1249" w:type="dxa"/>
+          </w:tcPr>
+          <w:p>
+            <w:pPr>
+              <w:rPr>
+                <w:rFonts w:ascii="Aptos" w:hAnsi="Aptos"/>
+              </w:rPr>
+            </w:pPr>
+            <w:r>
+              <w:rPr>
+                <w:rFonts w:ascii="Aptos" w:hAnsi="Aptos"/>
+              </w:rPr>
+              <w:t>0</w:t>
+            </w:r>
+          </w:p>
+        </w:tc>
+        <w:tc>
+          <w:tcPr>
+            <w:tcW w:w="1353" w:type="dxa"/>
+            <w:vMerge/>
           </w:tcPr>
           <w:p>
             <w:pPr>
@@ -1298,7 +1471,7 @@
         </w:tc>
         <w:tc>
           <w:tcPr>
-            <w:tcW w:w="1275" w:type="dxa"/>
+            <w:tcW w:w="3943" w:type="dxa"/>
           </w:tcPr>
           <w:p>
             <w:pPr>
@@ -1306,39 +1479,19 @@
                 <w:rFonts w:ascii="Aptos" w:hAnsi="Aptos"/>
               </w:rPr>
             </w:pPr>
-          </w:p>
-        </w:tc>
-        <w:tc>
-          <w:tcPr>
-            <w:tcW w:w="1309" w:type="dxa"/>
-            <w:vMerge/>
-          </w:tcPr>
-          <w:p>
-            <w:pPr>
-              <w:rPr>
-                <w:rFonts w:ascii="Aptos" w:hAnsi="Aptos"/>
-              </w:rPr>
-            </w:pPr>
-          </w:p>
-        </w:tc>
-        <w:tc>
-          <w:tcPr>
-            <w:tcW w:w="4180" w:type="dxa"/>
-            <w:vMerge/>
-          </w:tcPr>
-          <w:p>
-            <w:pPr>
-              <w:rPr>
-                <w:rFonts w:ascii="Aptos" w:hAnsi="Aptos"/>
-              </w:rPr>
-            </w:pPr>
+            <w:r>
+              <w:rPr>
+                <w:rFonts w:ascii="Aptos" w:hAnsi="Aptos"/>
+              </w:rPr>
+              <w:t>Again, I want it to be adjustable</w:t>
+            </w:r>
           </w:p>
         </w:tc>
       </w:tr>
       <w:tr>
         <w:tc>
           <w:tcPr>
-            <w:tcW w:w="664" w:type="dxa"/>
+            <w:tcW w:w="663" w:type="dxa"/>
           </w:tcPr>
           <w:p>
             <w:pPr>
@@ -1357,7 +1510,44 @@
         </w:tc>
         <w:tc>
           <w:tcPr>
-            <w:tcW w:w="1428" w:type="dxa"/>
+            <w:tcW w:w="1422" w:type="dxa"/>
+          </w:tcPr>
+          <w:p>
+            <w:pPr>
+              <w:rPr>
+                <w:rFonts w:ascii="Aptos" w:hAnsi="Aptos"/>
+              </w:rPr>
+            </w:pPr>
+            <w:r>
+              <w:rPr>
+                <w:rFonts w:ascii="Aptos" w:hAnsi="Aptos"/>
+              </w:rPr>
+              <w:t>yes</w:t>
+            </w:r>
+          </w:p>
+        </w:tc>
+        <w:tc>
+          <w:tcPr>
+            <w:tcW w:w="1249" w:type="dxa"/>
+          </w:tcPr>
+          <w:p>
+            <w:pPr>
+              <w:rPr>
+                <w:rFonts w:ascii="Aptos" w:hAnsi="Aptos"/>
+              </w:rPr>
+            </w:pPr>
+            <w:r>
+              <w:rPr>
+                <w:rFonts w:ascii="Aptos" w:hAnsi="Aptos"/>
+              </w:rPr>
+              <w:t>1</w:t>
+            </w:r>
+          </w:p>
+        </w:tc>
+        <w:tc>
+          <w:tcPr>
+            <w:tcW w:w="1353" w:type="dxa"/>
+            <w:vMerge/>
           </w:tcPr>
           <w:p>
             <w:pPr>
@@ -1369,7 +1559,7 @@
         </w:tc>
         <w:tc>
           <w:tcPr>
-            <w:tcW w:w="1275" w:type="dxa"/>
+            <w:tcW w:w="3943" w:type="dxa"/>
           </w:tcPr>
           <w:p>
             <w:pPr>
@@ -1377,35 +1567,16 @@
                 <w:rFonts w:ascii="Aptos" w:hAnsi="Aptos"/>
               </w:rPr>
             </w:pPr>
-          </w:p>
-        </w:tc>
-        <w:tc>
-          <w:tcPr>
-            <w:tcW w:w="1309" w:type="dxa"/>
-            <w:vMerge/>
-          </w:tcPr>
-          <w:p>
-            <w:pPr>
-              <w:rPr>
-                <w:rFonts w:ascii="Aptos" w:hAnsi="Aptos"/>
-              </w:rPr>
-            </w:pPr>
-          </w:p>
-        </w:tc>
-        <w:tc>
-          <w:tcPr>
-            <w:tcW w:w="4180" w:type="dxa"/>
-            <w:vMerge/>
-          </w:tcPr>
-          <w:p>
-            <w:pPr>
-              <w:rPr>
-                <w:rFonts w:ascii="Aptos" w:hAnsi="Aptos"/>
-              </w:rPr>
-            </w:pPr>
+            <w:r>
+              <w:rPr>
+                <w:rFonts w:ascii="Aptos" w:hAnsi="Aptos"/>
+              </w:rPr>
+              <w:t>resizable interaction is great, but a little bit hard to grab it using hands (harder than controller, I will say)</w:t>
+            </w:r>
           </w:p>
         </w:tc>
       </w:tr>
+      <w:bookmarkEnd w:id="9"/>
     </w:tbl>
     <w:p>
       <w:pPr>
@@ -1446,15 +1617,7 @@
           <w:b/>
           <w:bCs/>
         </w:rPr>
-        <w:t xml:space="preserve">Participant </w:t>
-      </w:r>
-      <w:r>
-        <w:rPr>
-          <w:rFonts w:ascii="Aptos" w:hAnsi="Aptos"/>
-          <w:b/>
-          <w:bCs/>
-        </w:rPr>
-        <w:t>3</w:t>
+        <w:t>Participant 3</w:t>
       </w:r>
     </w:p>
     <w:tbl>
@@ -1465,15 +1628,15 @@
       </w:tblPr>
       <w:tblGrid>
         <w:gridCol w:w="663"/>
-        <w:gridCol w:w="1422"/>
-        <w:gridCol w:w="1249"/>
+        <w:gridCol w:w="1421"/>
+        <w:gridCol w:w="1244"/>
         <w:gridCol w:w="1353"/>
-        <w:gridCol w:w="3943"/>
+        <w:gridCol w:w="3949"/>
       </w:tblGrid>
       <w:tr>
         <w:tc>
           <w:tcPr>
-            <w:tcW w:w="664" w:type="dxa"/>
+            <w:tcW w:w="663" w:type="dxa"/>
           </w:tcPr>
           <w:p>
             <w:pPr>
@@ -1494,7 +1657,7 @@
         </w:tc>
         <w:tc>
           <w:tcPr>
-            <w:tcW w:w="1428" w:type="dxa"/>
+            <w:tcW w:w="1421" w:type="dxa"/>
           </w:tcPr>
           <w:p>
             <w:pPr>
@@ -1513,7 +1676,7 @@
         </w:tc>
         <w:tc>
           <w:tcPr>
-            <w:tcW w:w="1275" w:type="dxa"/>
+            <w:tcW w:w="1244" w:type="dxa"/>
           </w:tcPr>
           <w:p>
             <w:pPr>
@@ -1546,7 +1709,7 @@
         </w:tc>
         <w:tc>
           <w:tcPr>
-            <w:tcW w:w="1309" w:type="dxa"/>
+            <w:tcW w:w="1353" w:type="dxa"/>
           </w:tcPr>
           <w:p>
             <w:pPr>
@@ -1579,7 +1742,7 @@
         </w:tc>
         <w:tc>
           <w:tcPr>
-            <w:tcW w:w="4180" w:type="dxa"/>
+            <w:tcW w:w="3949" w:type="dxa"/>
           </w:tcPr>
           <w:p>
             <w:pPr>
@@ -1614,7 +1777,7 @@
       <w:tr>
         <w:tc>
           <w:tcPr>
-            <w:tcW w:w="664" w:type="dxa"/>
+            <w:tcW w:w="663" w:type="dxa"/>
           </w:tcPr>
           <w:p>
             <w:pPr>
@@ -1623,6 +1786,7 @@
                 <w:rFonts w:ascii="Aptos" w:hAnsi="Aptos"/>
               </w:rPr>
             </w:pPr>
+            <w:bookmarkStart w:id="11" w:name="_Hlk212209811"/>
             <w:r>
               <w:rPr>
                 <w:rFonts w:ascii="Aptos" w:hAnsi="Aptos"/>
@@ -1633,7 +1797,139 @@
         </w:tc>
         <w:tc>
           <w:tcPr>
-            <w:tcW w:w="1428" w:type="dxa"/>
+            <w:tcW w:w="1421" w:type="dxa"/>
+          </w:tcPr>
+          <w:p>
+            <w:pPr>
+              <w:rPr>
+                <w:rFonts w:ascii="Aptos" w:hAnsi="Aptos"/>
+              </w:rPr>
+            </w:pPr>
+            <w:r>
+              <w:rPr>
+                <w:rFonts w:ascii="Aptos" w:hAnsi="Aptos"/>
+              </w:rPr>
+              <w:t>yes</w:t>
+            </w:r>
+          </w:p>
+        </w:tc>
+        <w:tc>
+          <w:tcPr>
+            <w:tcW w:w="1244" w:type="dxa"/>
+          </w:tcPr>
+          <w:p>
+            <w:pPr>
+              <w:rPr>
+                <w:rFonts w:ascii="Aptos" w:hAnsi="Aptos"/>
+              </w:rPr>
+            </w:pPr>
+            <w:r>
+              <w:rPr>
+                <w:rFonts w:ascii="Aptos" w:hAnsi="Aptos"/>
+              </w:rPr>
+              <w:t>0</w:t>
+            </w:r>
+          </w:p>
+        </w:tc>
+        <w:tc>
+          <w:tcPr>
+            <w:tcW w:w="1353" w:type="dxa"/>
+            <w:vMerge w:val="restart"/>
+          </w:tcPr>
+          <w:p>
+            <w:pPr>
+              <w:rPr>
+                <w:rFonts w:ascii="Aptos" w:hAnsi="Aptos"/>
+              </w:rPr>
+            </w:pPr>
+            <w:r>
+              <w:rPr>
+                <w:rFonts w:ascii="Aptos" w:hAnsi="Aptos"/>
+              </w:rPr>
+              <w:t>3</w:t>
+            </w:r>
+          </w:p>
+        </w:tc>
+        <w:tc>
+          <w:tcPr>
+            <w:tcW w:w="3949" w:type="dxa"/>
+            <w:vMerge w:val="restart"/>
+          </w:tcPr>
+          <w:p>
+            <w:pPr>
+              <w:rPr>
+                <w:rFonts w:ascii="Aptos" w:hAnsi="Aptos"/>
+              </w:rPr>
+            </w:pPr>
+            <w:r>
+              <w:rPr>
+                <w:rFonts w:ascii="Aptos" w:hAnsi="Aptos"/>
+              </w:rPr>
+              <w:t>I would like the pen could be one single item with colors changeable using hand gestures, rather than multiple pens and disappear after I stop posing the gesture</w:t>
+            </w:r>
+          </w:p>
+        </w:tc>
+      </w:tr>
+      <w:tr>
+        <w:tc>
+          <w:tcPr>
+            <w:tcW w:w="663" w:type="dxa"/>
+          </w:tcPr>
+          <w:p>
+            <w:pPr>
+              <w:jc w:val="center"/>
+              <w:rPr>
+                <w:rFonts w:ascii="Aptos" w:hAnsi="Aptos"/>
+              </w:rPr>
+            </w:pPr>
+            <w:r>
+              <w:rPr>
+                <w:rFonts w:ascii="Aptos" w:hAnsi="Aptos"/>
+              </w:rPr>
+              <w:t>2</w:t>
+            </w:r>
+          </w:p>
+        </w:tc>
+        <w:tc>
+          <w:tcPr>
+            <w:tcW w:w="1421" w:type="dxa"/>
+          </w:tcPr>
+          <w:p>
+            <w:pPr>
+              <w:rPr>
+                <w:rFonts w:ascii="Aptos" w:hAnsi="Aptos"/>
+              </w:rPr>
+            </w:pPr>
+            <w:r>
+              <w:rPr>
+                <w:rFonts w:ascii="Aptos" w:hAnsi="Aptos"/>
+              </w:rPr>
+              <w:t>yes</w:t>
+            </w:r>
+          </w:p>
+        </w:tc>
+        <w:tc>
+          <w:tcPr>
+            <w:tcW w:w="1244" w:type="dxa"/>
+          </w:tcPr>
+          <w:p>
+            <w:pPr>
+              <w:rPr>
+                <w:rFonts w:ascii="Aptos" w:hAnsi="Aptos"/>
+              </w:rPr>
+            </w:pPr>
+            <w:r>
+              <w:rPr>
+                <w:rFonts w:ascii="Aptos" w:hAnsi="Aptos"/>
+              </w:rPr>
+              <w:t>0</w:t>
+            </w:r>
+          </w:p>
+        </w:tc>
+        <w:tc>
+          <w:tcPr>
+            <w:tcW w:w="1353" w:type="dxa"/>
+            <w:vMerge/>
           </w:tcPr>
           <w:p>
             <w:pPr>
@@ -1645,33 +1941,8 @@
         </w:tc>
         <w:tc>
           <w:tcPr>
-            <w:tcW w:w="1275" w:type="dxa"/>
-          </w:tcPr>
-          <w:p>
-            <w:pPr>
-              <w:rPr>
-                <w:rFonts w:ascii="Aptos" w:hAnsi="Aptos"/>
-              </w:rPr>
-            </w:pPr>
-          </w:p>
-        </w:tc>
-        <w:tc>
-          <w:tcPr>
-            <w:tcW w:w="1309" w:type="dxa"/>
-            <w:vMerge w:val="restart"/>
-          </w:tcPr>
-          <w:p>
-            <w:pPr>
-              <w:rPr>
-                <w:rFonts w:ascii="Aptos" w:hAnsi="Aptos"/>
-              </w:rPr>
-            </w:pPr>
-          </w:p>
-        </w:tc>
-        <w:tc>
-          <w:tcPr>
-            <w:tcW w:w="4180" w:type="dxa"/>
-            <w:vMerge w:val="restart"/>
+            <w:tcW w:w="3949" w:type="dxa"/>
+            <w:vMerge/>
           </w:tcPr>
           <w:p>
             <w:pPr>
@@ -1685,7 +1956,7 @@
       <w:tr>
         <w:tc>
           <w:tcPr>
-            <w:tcW w:w="664" w:type="dxa"/>
+            <w:tcW w:w="663" w:type="dxa"/>
           </w:tcPr>
           <w:p>
             <w:pPr>
@@ -1698,13 +1969,50 @@
               <w:rPr>
                 <w:rFonts w:ascii="Aptos" w:hAnsi="Aptos"/>
               </w:rPr>
-              <w:t>2</w:t>
+              <w:t>3</w:t>
             </w:r>
           </w:p>
         </w:tc>
         <w:tc>
           <w:tcPr>
-            <w:tcW w:w="1428" w:type="dxa"/>
+            <w:tcW w:w="1421" w:type="dxa"/>
+          </w:tcPr>
+          <w:p>
+            <w:pPr>
+              <w:rPr>
+                <w:rFonts w:ascii="Aptos" w:hAnsi="Aptos"/>
+              </w:rPr>
+            </w:pPr>
+            <w:r>
+              <w:rPr>
+                <w:rFonts w:ascii="Aptos" w:hAnsi="Aptos"/>
+              </w:rPr>
+              <w:t>yes</w:t>
+            </w:r>
+          </w:p>
+        </w:tc>
+        <w:tc>
+          <w:tcPr>
+            <w:tcW w:w="1244" w:type="dxa"/>
+          </w:tcPr>
+          <w:p>
+            <w:pPr>
+              <w:rPr>
+                <w:rFonts w:ascii="Aptos" w:hAnsi="Aptos"/>
+              </w:rPr>
+            </w:pPr>
+            <w:r>
+              <w:rPr>
+                <w:rFonts w:ascii="Aptos" w:hAnsi="Aptos"/>
+              </w:rPr>
+              <w:t>0</w:t>
+            </w:r>
+          </w:p>
+        </w:tc>
+        <w:tc>
+          <w:tcPr>
+            <w:tcW w:w="1353" w:type="dxa"/>
+            <w:vMerge/>
           </w:tcPr>
           <w:p>
             <w:pPr>
@@ -1716,32 +2024,7 @@
         </w:tc>
         <w:tc>
           <w:tcPr>
-            <w:tcW w:w="1275" w:type="dxa"/>
-          </w:tcPr>
-          <w:p>
-            <w:pPr>
-              <w:rPr>
-                <w:rFonts w:ascii="Aptos" w:hAnsi="Aptos"/>
-              </w:rPr>
-            </w:pPr>
-          </w:p>
-        </w:tc>
-        <w:tc>
-          <w:tcPr>
-            <w:tcW w:w="1309" w:type="dxa"/>
-            <w:vMerge/>
-          </w:tcPr>
-          <w:p>
-            <w:pPr>
-              <w:rPr>
-                <w:rFonts w:ascii="Aptos" w:hAnsi="Aptos"/>
-              </w:rPr>
-            </w:pPr>
-          </w:p>
-        </w:tc>
-        <w:tc>
-          <w:tcPr>
-            <w:tcW w:w="4180" w:type="dxa"/>
+            <w:tcW w:w="3949" w:type="dxa"/>
             <w:vMerge/>
           </w:tcPr>
           <w:p>
@@ -1756,78 +2039,7 @@
       <w:tr>
         <w:tc>
           <w:tcPr>
-            <w:tcW w:w="664" w:type="dxa"/>
-          </w:tcPr>
-          <w:p>
-            <w:pPr>
-              <w:jc w:val="center"/>
-              <w:rPr>
-                <w:rFonts w:ascii="Aptos" w:hAnsi="Aptos"/>
-              </w:rPr>
-            </w:pPr>
-            <w:r>
-              <w:rPr>
-                <w:rFonts w:ascii="Aptos" w:hAnsi="Aptos"/>
-              </w:rPr>
-              <w:t>3</w:t>
-            </w:r>
-          </w:p>
-        </w:tc>
-        <w:tc>
-          <w:tcPr>
-            <w:tcW w:w="1428" w:type="dxa"/>
-          </w:tcPr>
-          <w:p>
-            <w:pPr>
-              <w:rPr>
-                <w:rFonts w:ascii="Aptos" w:hAnsi="Aptos"/>
-              </w:rPr>
-            </w:pPr>
-          </w:p>
-        </w:tc>
-        <w:tc>
-          <w:tcPr>
-            <w:tcW w:w="1275" w:type="dxa"/>
-          </w:tcPr>
-          <w:p>
-            <w:pPr>
-              <w:rPr>
-                <w:rFonts w:ascii="Aptos" w:hAnsi="Aptos"/>
-              </w:rPr>
-            </w:pPr>
-          </w:p>
-        </w:tc>
-        <w:tc>
-          <w:tcPr>
-            <w:tcW w:w="1309" w:type="dxa"/>
-            <w:vMerge/>
-          </w:tcPr>
-          <w:p>
-            <w:pPr>
-              <w:rPr>
-                <w:rFonts w:ascii="Aptos" w:hAnsi="Aptos"/>
-              </w:rPr>
-            </w:pPr>
-          </w:p>
-        </w:tc>
-        <w:tc>
-          <w:tcPr>
-            <w:tcW w:w="4180" w:type="dxa"/>
-            <w:vMerge/>
-          </w:tcPr>
-          <w:p>
-            <w:pPr>
-              <w:rPr>
-                <w:rFonts w:ascii="Aptos" w:hAnsi="Aptos"/>
-              </w:rPr>
-            </w:pPr>
-          </w:p>
-        </w:tc>
-      </w:tr>
-      <w:tr>
-        <w:tc>
-          <w:tcPr>
-            <w:tcW w:w="664" w:type="dxa"/>
+            <w:tcW w:w="663" w:type="dxa"/>
           </w:tcPr>
           <w:p>
             <w:pPr>
@@ -1846,7 +2058,44 @@
         </w:tc>
         <w:tc>
           <w:tcPr>
-            <w:tcW w:w="1428" w:type="dxa"/>
+            <w:tcW w:w="1421" w:type="dxa"/>
+          </w:tcPr>
+          <w:p>
+            <w:pPr>
+              <w:rPr>
+                <w:rFonts w:ascii="Aptos" w:hAnsi="Aptos"/>
+              </w:rPr>
+            </w:pPr>
+            <w:r>
+              <w:rPr>
+                <w:rFonts w:ascii="Aptos" w:hAnsi="Aptos"/>
+              </w:rPr>
+              <w:t>yes</w:t>
+            </w:r>
+          </w:p>
+        </w:tc>
+        <w:tc>
+          <w:tcPr>
+            <w:tcW w:w="1244" w:type="dxa"/>
+          </w:tcPr>
+          <w:p>
+            <w:pPr>
+              <w:rPr>
+                <w:rFonts w:ascii="Aptos" w:hAnsi="Aptos"/>
+              </w:rPr>
+            </w:pPr>
+            <w:r>
+              <w:rPr>
+                <w:rFonts w:ascii="Aptos" w:hAnsi="Aptos"/>
+              </w:rPr>
+              <w:t>0</w:t>
+            </w:r>
+          </w:p>
+        </w:tc>
+        <w:tc>
+          <w:tcPr>
+            <w:tcW w:w="1353" w:type="dxa"/>
+            <w:vMerge/>
           </w:tcPr>
           <w:p>
             <w:pPr>
@@ -1858,19 +2107,7 @@
         </w:tc>
         <w:tc>
           <w:tcPr>
-            <w:tcW w:w="1275" w:type="dxa"/>
-          </w:tcPr>
-          <w:p>
-            <w:pPr>
-              <w:rPr>
-                <w:rFonts w:ascii="Aptos" w:hAnsi="Aptos"/>
-              </w:rPr>
-            </w:pPr>
-          </w:p>
-        </w:tc>
-        <w:tc>
-          <w:tcPr>
-            <w:tcW w:w="1309" w:type="dxa"/>
+            <w:tcW w:w="3949" w:type="dxa"/>
             <w:vMerge/>
           </w:tcPr>
           <w:p>
@@ -1881,20 +2118,8 @@
             </w:pPr>
           </w:p>
         </w:tc>
-        <w:tc>
-          <w:tcPr>
-            <w:tcW w:w="4180" w:type="dxa"/>
-            <w:vMerge/>
-          </w:tcPr>
-          <w:p>
-            <w:pPr>
-              <w:rPr>
-                <w:rFonts w:ascii="Aptos" w:hAnsi="Aptos"/>
-              </w:rPr>
-            </w:pPr>
-          </w:p>
-        </w:tc>
       </w:tr>
+      <w:bookmarkEnd w:id="11"/>
     </w:tbl>
     <w:p>
       <w:pPr>
@@ -1917,15 +2142,7 @@
           <w:b/>
           <w:bCs/>
         </w:rPr>
-        <w:t xml:space="preserve">Participant </w:t>
-      </w:r>
-      <w:r>
-        <w:rPr>
-          <w:rFonts w:ascii="Aptos" w:hAnsi="Aptos"/>
-          <w:b/>
-          <w:bCs/>
-        </w:rPr>
-        <w:t>4</w:t>
+        <w:t>Participant 4</w:t>
       </w:r>
     </w:p>
     <w:tbl>
@@ -1944,7 +2161,7 @@
       <w:tr>
         <w:tc>
           <w:tcPr>
-            <w:tcW w:w="664" w:type="dxa"/>
+            <w:tcW w:w="663" w:type="dxa"/>
           </w:tcPr>
           <w:p>
             <w:pPr>
@@ -1965,7 +2182,7 @@
         </w:tc>
         <w:tc>
           <w:tcPr>
-            <w:tcW w:w="1429" w:type="dxa"/>
+            <w:tcW w:w="1423" w:type="dxa"/>
           </w:tcPr>
           <w:p>
             <w:pPr>
@@ -1984,7 +2201,7 @@
         </w:tc>
         <w:tc>
           <w:tcPr>
-            <w:tcW w:w="1276" w:type="dxa"/>
+            <w:tcW w:w="1248" w:type="dxa"/>
           </w:tcPr>
           <w:p>
             <w:pPr>
@@ -2017,7 +2234,7 @@
         </w:tc>
         <w:tc>
           <w:tcPr>
-            <w:tcW w:w="1297" w:type="dxa"/>
+            <w:tcW w:w="1353" w:type="dxa"/>
           </w:tcPr>
           <w:p>
             <w:pPr>
@@ -2050,7 +2267,7 @@
         </w:tc>
         <w:tc>
           <w:tcPr>
-            <w:tcW w:w="4190" w:type="dxa"/>
+            <w:tcW w:w="3943" w:type="dxa"/>
           </w:tcPr>
           <w:p>
             <w:pPr>
@@ -2085,7 +2302,7 @@
       <w:tr>
         <w:tc>
           <w:tcPr>
-            <w:tcW w:w="664" w:type="dxa"/>
+            <w:tcW w:w="663" w:type="dxa"/>
           </w:tcPr>
           <w:p>
             <w:pPr>
@@ -2094,6 +2311,7 @@
                 <w:rFonts w:ascii="Aptos" w:hAnsi="Aptos"/>
               </w:rPr>
             </w:pPr>
+            <w:bookmarkStart w:id="12" w:name="_Hlk212210194"/>
             <w:r>
               <w:rPr>
                 <w:rFonts w:ascii="Aptos" w:hAnsi="Aptos"/>
@@ -2104,7 +2322,141 @@
         </w:tc>
         <w:tc>
           <w:tcPr>
-            <w:tcW w:w="1429" w:type="dxa"/>
+            <w:tcW w:w="1423" w:type="dxa"/>
+          </w:tcPr>
+          <w:p>
+            <w:pPr>
+              <w:rPr>
+                <w:rFonts w:ascii="Aptos" w:hAnsi="Aptos"/>
+              </w:rPr>
+            </w:pPr>
+            <w:r>
+              <w:rPr>
+                <w:rFonts w:ascii="Aptos" w:hAnsi="Aptos"/>
+              </w:rPr>
+              <w:t>yes</w:t>
+            </w:r>
+          </w:p>
+        </w:tc>
+        <w:tc>
+          <w:tcPr>
+            <w:tcW w:w="1248" w:type="dxa"/>
+          </w:tcPr>
+          <w:p>
+            <w:pPr>
+              <w:rPr>
+                <w:rFonts w:ascii="Aptos" w:hAnsi="Aptos"/>
+              </w:rPr>
+            </w:pPr>
+            <w:r>
+              <w:rPr>
+                <w:rFonts w:ascii="Aptos" w:hAnsi="Aptos"/>
+              </w:rPr>
+              <w:t>0</w:t>
+            </w:r>
+          </w:p>
+        </w:tc>
+        <w:tc>
+          <w:tcPr>
+            <w:tcW w:w="1353" w:type="dxa"/>
+            <w:vMerge w:val="restart"/>
+          </w:tcPr>
+          <w:p>
+            <w:pPr>
+              <w:rPr>
+                <w:rFonts w:ascii="Aptos" w:hAnsi="Aptos"/>
+              </w:rPr>
+            </w:pPr>
+            <w:r>
+              <w:rPr>
+                <w:rFonts w:ascii="Aptos" w:hAnsi="Aptos"/>
+              </w:rPr>
+              <w:t>4</w:t>
+            </w:r>
+          </w:p>
+        </w:tc>
+        <w:tc>
+          <w:tcPr>
+            <w:tcW w:w="3943" w:type="dxa"/>
+            <w:vMerge w:val="restart"/>
+          </w:tcPr>
+          <w:p>
+            <w:pPr>
+              <w:rPr>
+                <w:rFonts w:ascii="Aptos" w:hAnsi="Aptos"/>
+                <w:lang w:val="en-AU" w:eastAsia="zh-CN"/>
+              </w:rPr>
+            </w:pPr>
+            <w:r>
+              <w:rPr>
+                <w:rFonts w:ascii="Aptos" w:hAnsi="Aptos"/>
+                <w:lang w:val="en-AU" w:eastAsia="zh-CN"/>
+              </w:rPr>
+              <w:t>What if the user is left-handed? Only allows using right hand to draw is limited, you can change it into both hand gestures so that everyone can use comfortably.</w:t>
+            </w:r>
+          </w:p>
+        </w:tc>
+      </w:tr>
+      <w:tr>
+        <w:tc>
+          <w:tcPr>
+            <w:tcW w:w="663" w:type="dxa"/>
+          </w:tcPr>
+          <w:p>
+            <w:pPr>
+              <w:jc w:val="center"/>
+              <w:rPr>
+                <w:rFonts w:ascii="Aptos" w:hAnsi="Aptos"/>
+              </w:rPr>
+            </w:pPr>
+            <w:r>
+              <w:rPr>
+                <w:rFonts w:ascii="Aptos" w:hAnsi="Aptos"/>
+              </w:rPr>
+              <w:t>2</w:t>
+            </w:r>
+          </w:p>
+        </w:tc>
+        <w:tc>
+          <w:tcPr>
+            <w:tcW w:w="1423" w:type="dxa"/>
+          </w:tcPr>
+          <w:p>
+            <w:pPr>
+              <w:rPr>
+                <w:rFonts w:ascii="Aptos" w:hAnsi="Aptos"/>
+              </w:rPr>
+            </w:pPr>
+            <w:r>
+              <w:rPr>
+                <w:rFonts w:ascii="Aptos" w:hAnsi="Aptos"/>
+              </w:rPr>
+              <w:t>yes</w:t>
+            </w:r>
+          </w:p>
+        </w:tc>
+        <w:tc>
+          <w:tcPr>
+            <w:tcW w:w="1248" w:type="dxa"/>
+          </w:tcPr>
+          <w:p>
+            <w:pPr>
+              <w:rPr>
+                <w:rFonts w:ascii="Aptos" w:hAnsi="Aptos"/>
+              </w:rPr>
+            </w:pPr>
+            <w:r>
+              <w:rPr>
+                <w:rFonts w:ascii="Aptos" w:hAnsi="Aptos"/>
+              </w:rPr>
+              <w:t>0</w:t>
+            </w:r>
+          </w:p>
+        </w:tc>
+        <w:tc>
+          <w:tcPr>
+            <w:tcW w:w="1353" w:type="dxa"/>
+            <w:vMerge/>
           </w:tcPr>
           <w:p>
             <w:pPr>
@@ -2116,33 +2468,8 @@
         </w:tc>
         <w:tc>
           <w:tcPr>
-            <w:tcW w:w="1276" w:type="dxa"/>
-          </w:tcPr>
-          <w:p>
-            <w:pPr>
-              <w:rPr>
-                <w:rFonts w:ascii="Aptos" w:hAnsi="Aptos"/>
-              </w:rPr>
-            </w:pPr>
-          </w:p>
-        </w:tc>
-        <w:tc>
-          <w:tcPr>
-            <w:tcW w:w="1297" w:type="dxa"/>
-            <w:vMerge w:val="restart"/>
-          </w:tcPr>
-          <w:p>
-            <w:pPr>
-              <w:rPr>
-                <w:rFonts w:ascii="Aptos" w:hAnsi="Aptos"/>
-              </w:rPr>
-            </w:pPr>
-          </w:p>
-        </w:tc>
-        <w:tc>
-          <w:tcPr>
-            <w:tcW w:w="4190" w:type="dxa"/>
-            <w:vMerge w:val="restart"/>
+            <w:tcW w:w="3943" w:type="dxa"/>
+            <w:vMerge/>
           </w:tcPr>
           <w:p>
             <w:pPr>
@@ -2156,7 +2483,7 @@
       <w:tr>
         <w:tc>
           <w:tcPr>
-            <w:tcW w:w="664" w:type="dxa"/>
+            <w:tcW w:w="663" w:type="dxa"/>
           </w:tcPr>
           <w:p>
             <w:pPr>
@@ -2169,13 +2496,50 @@
               <w:rPr>
                 <w:rFonts w:ascii="Aptos" w:hAnsi="Aptos"/>
               </w:rPr>
-              <w:t>2</w:t>
+              <w:t>3</w:t>
             </w:r>
           </w:p>
         </w:tc>
         <w:tc>
           <w:tcPr>
-            <w:tcW w:w="1429" w:type="dxa"/>
+            <w:tcW w:w="1423" w:type="dxa"/>
+          </w:tcPr>
+          <w:p>
+            <w:pPr>
+              <w:rPr>
+                <w:rFonts w:ascii="Aptos" w:hAnsi="Aptos"/>
+              </w:rPr>
+            </w:pPr>
+            <w:r>
+              <w:rPr>
+                <w:rFonts w:ascii="Aptos" w:hAnsi="Aptos"/>
+              </w:rPr>
+              <w:t>yes</w:t>
+            </w:r>
+          </w:p>
+        </w:tc>
+        <w:tc>
+          <w:tcPr>
+            <w:tcW w:w="1248" w:type="dxa"/>
+          </w:tcPr>
+          <w:p>
+            <w:pPr>
+              <w:rPr>
+                <w:rFonts w:ascii="Aptos" w:hAnsi="Aptos"/>
+              </w:rPr>
+            </w:pPr>
+            <w:r>
+              <w:rPr>
+                <w:rFonts w:ascii="Aptos" w:hAnsi="Aptos"/>
+              </w:rPr>
+              <w:t>1</w:t>
+            </w:r>
+          </w:p>
+        </w:tc>
+        <w:tc>
+          <w:tcPr>
+            <w:tcW w:w="1353" w:type="dxa"/>
+            <w:vMerge/>
           </w:tcPr>
           <w:p>
             <w:pPr>
@@ -2187,32 +2551,7 @@
         </w:tc>
         <w:tc>
           <w:tcPr>
-            <w:tcW w:w="1276" w:type="dxa"/>
-          </w:tcPr>
-          <w:p>
-            <w:pPr>
-              <w:rPr>
-                <w:rFonts w:ascii="Aptos" w:hAnsi="Aptos"/>
-              </w:rPr>
-            </w:pPr>
-          </w:p>
-        </w:tc>
-        <w:tc>
-          <w:tcPr>
-            <w:tcW w:w="1297" w:type="dxa"/>
-            <w:vMerge/>
-          </w:tcPr>
-          <w:p>
-            <w:pPr>
-              <w:rPr>
-                <w:rFonts w:ascii="Aptos" w:hAnsi="Aptos"/>
-              </w:rPr>
-            </w:pPr>
-          </w:p>
-        </w:tc>
-        <w:tc>
-          <w:tcPr>
-            <w:tcW w:w="4190" w:type="dxa"/>
+            <w:tcW w:w="3943" w:type="dxa"/>
             <w:vMerge/>
           </w:tcPr>
           <w:p>
@@ -2227,78 +2566,7 @@
       <w:tr>
         <w:tc>
           <w:tcPr>
-            <w:tcW w:w="664" w:type="dxa"/>
-          </w:tcPr>
-          <w:p>
-            <w:pPr>
-              <w:jc w:val="center"/>
-              <w:rPr>
-                <w:rFonts w:ascii="Aptos" w:hAnsi="Aptos"/>
-              </w:rPr>
-            </w:pPr>
-            <w:r>
-              <w:rPr>
-                <w:rFonts w:ascii="Aptos" w:hAnsi="Aptos"/>
-              </w:rPr>
-              <w:t>3</w:t>
-            </w:r>
-          </w:p>
-        </w:tc>
-        <w:tc>
-          <w:tcPr>
-            <w:tcW w:w="1429" w:type="dxa"/>
-          </w:tcPr>
-          <w:p>
-            <w:pPr>
-              <w:rPr>
-                <w:rFonts w:ascii="Aptos" w:hAnsi="Aptos"/>
-              </w:rPr>
-            </w:pPr>
-          </w:p>
-        </w:tc>
-        <w:tc>
-          <w:tcPr>
-            <w:tcW w:w="1276" w:type="dxa"/>
-          </w:tcPr>
-          <w:p>
-            <w:pPr>
-              <w:rPr>
-                <w:rFonts w:ascii="Aptos" w:hAnsi="Aptos"/>
-              </w:rPr>
-            </w:pPr>
-          </w:p>
-        </w:tc>
-        <w:tc>
-          <w:tcPr>
-            <w:tcW w:w="1297" w:type="dxa"/>
-            <w:vMerge/>
-          </w:tcPr>
-          <w:p>
-            <w:pPr>
-              <w:rPr>
-                <w:rFonts w:ascii="Aptos" w:hAnsi="Aptos"/>
-              </w:rPr>
-            </w:pPr>
-          </w:p>
-        </w:tc>
-        <w:tc>
-          <w:tcPr>
-            <w:tcW w:w="4190" w:type="dxa"/>
-            <w:vMerge/>
-          </w:tcPr>
-          <w:p>
-            <w:pPr>
-              <w:rPr>
-                <w:rFonts w:ascii="Aptos" w:hAnsi="Aptos"/>
-              </w:rPr>
-            </w:pPr>
-          </w:p>
-        </w:tc>
-      </w:tr>
-      <w:tr>
-        <w:tc>
-          <w:tcPr>
-            <w:tcW w:w="664" w:type="dxa"/>
+            <w:tcW w:w="663" w:type="dxa"/>
           </w:tcPr>
           <w:p>
             <w:pPr>
@@ -2317,7 +2585,44 @@
         </w:tc>
         <w:tc>
           <w:tcPr>
-            <w:tcW w:w="1429" w:type="dxa"/>
+            <w:tcW w:w="1423" w:type="dxa"/>
+          </w:tcPr>
+          <w:p>
+            <w:pPr>
+              <w:rPr>
+                <w:rFonts w:ascii="Aptos" w:hAnsi="Aptos"/>
+              </w:rPr>
+            </w:pPr>
+            <w:r>
+              <w:rPr>
+                <w:rFonts w:ascii="Aptos" w:hAnsi="Aptos"/>
+              </w:rPr>
+              <w:t>yes</w:t>
+            </w:r>
+          </w:p>
+        </w:tc>
+        <w:tc>
+          <w:tcPr>
+            <w:tcW w:w="1248" w:type="dxa"/>
+          </w:tcPr>
+          <w:p>
+            <w:pPr>
+              <w:rPr>
+                <w:rFonts w:ascii="Aptos" w:hAnsi="Aptos"/>
+              </w:rPr>
+            </w:pPr>
+            <w:r>
+              <w:rPr>
+                <w:rFonts w:ascii="Aptos" w:hAnsi="Aptos"/>
+              </w:rPr>
+              <w:t>0</w:t>
+            </w:r>
+          </w:p>
+        </w:tc>
+        <w:tc>
+          <w:tcPr>
+            <w:tcW w:w="1353" w:type="dxa"/>
+            <w:vMerge/>
           </w:tcPr>
           <w:p>
             <w:pPr>
@@ -2329,19 +2634,7 @@
         </w:tc>
         <w:tc>
           <w:tcPr>
-            <w:tcW w:w="1276" w:type="dxa"/>
-          </w:tcPr>
-          <w:p>
-            <w:pPr>
-              <w:rPr>
-                <w:rFonts w:ascii="Aptos" w:hAnsi="Aptos"/>
-              </w:rPr>
-            </w:pPr>
-          </w:p>
-        </w:tc>
-        <w:tc>
-          <w:tcPr>
-            <w:tcW w:w="1297" w:type="dxa"/>
+            <w:tcW w:w="3943" w:type="dxa"/>
             <w:vMerge/>
           </w:tcPr>
           <w:p>
@@ -2352,20 +2645,8 @@
             </w:pPr>
           </w:p>
         </w:tc>
-        <w:tc>
-          <w:tcPr>
-            <w:tcW w:w="4190" w:type="dxa"/>
-            <w:vMerge/>
-          </w:tcPr>
-          <w:p>
-            <w:pPr>
-              <w:rPr>
-                <w:rFonts w:ascii="Aptos" w:hAnsi="Aptos"/>
-              </w:rPr>
-            </w:pPr>
-          </w:p>
-        </w:tc>
       </w:tr>
+      <w:bookmarkEnd w:id="12"/>
     </w:tbl>
     <w:p>
       <w:pPr>
@@ -2387,15 +2668,7 @@
           <w:b/>
           <w:bCs/>
         </w:rPr>
-        <w:t xml:space="preserve">Participant </w:t>
-      </w:r>
-      <w:r>
-        <w:rPr>
-          <w:rFonts w:ascii="Aptos" w:hAnsi="Aptos"/>
-          <w:b/>
-          <w:bCs/>
-        </w:rPr>
-        <w:t>5</w:t>
+        <w:t>Participant 5</w:t>
       </w:r>
     </w:p>
     <w:tbl>
@@ -2406,15 +2679,15 @@
       </w:tblPr>
       <w:tblGrid>
         <w:gridCol w:w="663"/>
-        <w:gridCol w:w="1423"/>
-        <w:gridCol w:w="1248"/>
+        <w:gridCol w:w="1421"/>
+        <w:gridCol w:w="1243"/>
         <w:gridCol w:w="1353"/>
-        <w:gridCol w:w="3943"/>
+        <w:gridCol w:w="3950"/>
       </w:tblGrid>
       <w:tr>
         <w:tc>
           <w:tcPr>
-            <w:tcW w:w="664" w:type="dxa"/>
+            <w:tcW w:w="663" w:type="dxa"/>
           </w:tcPr>
           <w:p>
             <w:pPr>
@@ -2435,7 +2708,7 @@
         </w:tc>
         <w:tc>
           <w:tcPr>
-            <w:tcW w:w="1429" w:type="dxa"/>
+            <w:tcW w:w="1421" w:type="dxa"/>
           </w:tcPr>
           <w:p>
             <w:pPr>
@@ -2454,7 +2727,7 @@
         </w:tc>
         <w:tc>
           <w:tcPr>
-            <w:tcW w:w="1276" w:type="dxa"/>
+            <w:tcW w:w="1243" w:type="dxa"/>
           </w:tcPr>
           <w:p>
             <w:pPr>
@@ -2487,7 +2760,7 @@
         </w:tc>
         <w:tc>
           <w:tcPr>
-            <w:tcW w:w="1297" w:type="dxa"/>
+            <w:tcW w:w="1353" w:type="dxa"/>
           </w:tcPr>
           <w:p>
             <w:pPr>
@@ -2520,7 +2793,7 @@
         </w:tc>
         <w:tc>
           <w:tcPr>
-            <w:tcW w:w="4190" w:type="dxa"/>
+            <w:tcW w:w="3950" w:type="dxa"/>
           </w:tcPr>
           <w:p>
             <w:pPr>
@@ -2555,7 +2828,7 @@
       <w:tr>
         <w:tc>
           <w:tcPr>
-            <w:tcW w:w="664" w:type="dxa"/>
+            <w:tcW w:w="663" w:type="dxa"/>
           </w:tcPr>
           <w:p>
             <w:pPr>
@@ -2574,7 +2847,180 @@
         </w:tc>
         <w:tc>
           <w:tcPr>
-            <w:tcW w:w="1429" w:type="dxa"/>
+            <w:tcW w:w="1421" w:type="dxa"/>
+          </w:tcPr>
+          <w:p>
+            <w:pPr>
+              <w:rPr>
+                <w:rFonts w:ascii="Aptos" w:hAnsi="Aptos"/>
+              </w:rPr>
+            </w:pPr>
+            <w:r>
+              <w:rPr>
+                <w:rFonts w:ascii="Aptos" w:hAnsi="Aptos"/>
+              </w:rPr>
+              <w:t>yes</w:t>
+            </w:r>
+          </w:p>
+        </w:tc>
+        <w:tc>
+          <w:tcPr>
+            <w:tcW w:w="1243" w:type="dxa"/>
+          </w:tcPr>
+          <w:p>
+            <w:pPr>
+              <w:rPr>
+                <w:rFonts w:ascii="Aptos" w:hAnsi="Aptos"/>
+              </w:rPr>
+            </w:pPr>
+            <w:r>
+              <w:rPr>
+                <w:rFonts w:ascii="Aptos" w:hAnsi="Aptos"/>
+              </w:rPr>
+              <w:t>0</w:t>
+            </w:r>
+          </w:p>
+        </w:tc>
+        <w:tc>
+          <w:tcPr>
+            <w:tcW w:w="1353" w:type="dxa"/>
+            <w:vMerge w:val="restart"/>
+          </w:tcPr>
+          <w:p>
+            <w:pPr>
+              <w:rPr>
+                <w:rFonts w:ascii="Aptos" w:hAnsi="Aptos"/>
+              </w:rPr>
+            </w:pPr>
+            <w:r>
+              <w:rPr>
+                <w:rFonts w:ascii="Aptos" w:hAnsi="Aptos"/>
+              </w:rPr>
+              <w:t>3</w:t>
+            </w:r>
+          </w:p>
+        </w:tc>
+        <w:tc>
+          <w:tcPr>
+            <w:tcW w:w="3950" w:type="dxa"/>
+            <w:vMerge w:val="restart"/>
+          </w:tcPr>
+          <w:p>
+            <w:pPr>
+              <w:rPr>
+                <w:rFonts w:ascii="Aptos" w:hAnsi="Aptos"/>
+              </w:rPr>
+            </w:pPr>
+            <w:r>
+              <w:rPr>
+                <w:rFonts w:ascii="Aptos" w:hAnsi="Aptos"/>
+              </w:rPr>
+              <w:t xml:space="preserve">It’ s </w:t>
+            </w:r>
+            <w:proofErr w:type="gramStart"/>
+            <w:r>
+              <w:rPr>
+                <w:rFonts w:ascii="Aptos" w:hAnsi="Aptos"/>
+              </w:rPr>
+              <w:t>really hard</w:t>
+            </w:r>
+            <w:proofErr w:type="gramEnd"/>
+            <w:r>
+              <w:rPr>
+                <w:rFonts w:ascii="Aptos" w:hAnsi="Aptos"/>
+              </w:rPr>
+              <w:t xml:space="preserve"> for the system to recognize the L shape, you </w:t>
+            </w:r>
+            <w:proofErr w:type="gramStart"/>
+            <w:r>
+              <w:rPr>
+                <w:rFonts w:ascii="Aptos" w:hAnsi="Aptos"/>
+              </w:rPr>
+              <w:t>have to</w:t>
+            </w:r>
+            <w:proofErr w:type="gramEnd"/>
+            <w:r>
+              <w:rPr>
+                <w:rFonts w:ascii="Aptos" w:hAnsi="Aptos"/>
+              </w:rPr>
+              <w:t xml:space="preserve"> be in a strict position and pose.</w:t>
+            </w:r>
+          </w:p>
+          <w:p>
+            <w:pPr>
+              <w:rPr>
+                <w:rFonts w:ascii="Aptos" w:hAnsi="Aptos"/>
+              </w:rPr>
+            </w:pPr>
+            <w:r>
+              <w:rPr>
+                <w:rFonts w:ascii="Aptos" w:hAnsi="Aptos"/>
+              </w:rPr>
+              <w:t>Recommend to adding a switch tool UI through swiping, it will be fun</w:t>
+            </w:r>
+          </w:p>
+        </w:tc>
+      </w:tr>
+      <w:tr>
+        <w:tc>
+          <w:tcPr>
+            <w:tcW w:w="663" w:type="dxa"/>
+          </w:tcPr>
+          <w:p>
+            <w:pPr>
+              <w:jc w:val="center"/>
+              <w:rPr>
+                <w:rFonts w:ascii="Aptos" w:hAnsi="Aptos"/>
+              </w:rPr>
+            </w:pPr>
+            <w:r>
+              <w:rPr>
+                <w:rFonts w:ascii="Aptos" w:hAnsi="Aptos"/>
+              </w:rPr>
+              <w:t>2</w:t>
+            </w:r>
+          </w:p>
+        </w:tc>
+        <w:tc>
+          <w:tcPr>
+            <w:tcW w:w="1421" w:type="dxa"/>
+          </w:tcPr>
+          <w:p>
+            <w:pPr>
+              <w:rPr>
+                <w:rFonts w:ascii="Aptos" w:hAnsi="Aptos"/>
+              </w:rPr>
+            </w:pPr>
+            <w:r>
+              <w:rPr>
+                <w:rFonts w:ascii="Aptos" w:hAnsi="Aptos"/>
+              </w:rPr>
+              <w:t>yes</w:t>
+            </w:r>
+          </w:p>
+        </w:tc>
+        <w:tc>
+          <w:tcPr>
+            <w:tcW w:w="1243" w:type="dxa"/>
+          </w:tcPr>
+          <w:p>
+            <w:pPr>
+              <w:rPr>
+                <w:rFonts w:ascii="Aptos" w:hAnsi="Aptos"/>
+              </w:rPr>
+            </w:pPr>
+            <w:r>
+              <w:rPr>
+                <w:rFonts w:ascii="Aptos" w:hAnsi="Aptos"/>
+              </w:rPr>
+              <w:t>1</w:t>
+            </w:r>
+          </w:p>
+        </w:tc>
+        <w:tc>
+          <w:tcPr>
+            <w:tcW w:w="1353" w:type="dxa"/>
+            <w:vMerge/>
           </w:tcPr>
           <w:p>
             <w:pPr>
@@ -2586,33 +3032,8 @@
         </w:tc>
         <w:tc>
           <w:tcPr>
-            <w:tcW w:w="1276" w:type="dxa"/>
-          </w:tcPr>
-          <w:p>
-            <w:pPr>
-              <w:rPr>
-                <w:rFonts w:ascii="Aptos" w:hAnsi="Aptos"/>
-              </w:rPr>
-            </w:pPr>
-          </w:p>
-        </w:tc>
-        <w:tc>
-          <w:tcPr>
-            <w:tcW w:w="1297" w:type="dxa"/>
-            <w:vMerge w:val="restart"/>
-          </w:tcPr>
-          <w:p>
-            <w:pPr>
-              <w:rPr>
-                <w:rFonts w:ascii="Aptos" w:hAnsi="Aptos"/>
-              </w:rPr>
-            </w:pPr>
-          </w:p>
-        </w:tc>
-        <w:tc>
-          <w:tcPr>
-            <w:tcW w:w="4190" w:type="dxa"/>
-            <w:vMerge w:val="restart"/>
+            <w:tcW w:w="3950" w:type="dxa"/>
+            <w:vMerge/>
           </w:tcPr>
           <w:p>
             <w:pPr>
@@ -2626,7 +3047,7 @@
       <w:tr>
         <w:tc>
           <w:tcPr>
-            <w:tcW w:w="664" w:type="dxa"/>
+            <w:tcW w:w="663" w:type="dxa"/>
           </w:tcPr>
           <w:p>
             <w:pPr>
@@ -2639,13 +3060,50 @@
               <w:rPr>
                 <w:rFonts w:ascii="Aptos" w:hAnsi="Aptos"/>
               </w:rPr>
-              <w:t>2</w:t>
+              <w:t>3</w:t>
             </w:r>
           </w:p>
         </w:tc>
         <w:tc>
           <w:tcPr>
-            <w:tcW w:w="1429" w:type="dxa"/>
+            <w:tcW w:w="1421" w:type="dxa"/>
+          </w:tcPr>
+          <w:p>
+            <w:pPr>
+              <w:rPr>
+                <w:rFonts w:ascii="Aptos" w:hAnsi="Aptos"/>
+              </w:rPr>
+            </w:pPr>
+            <w:r>
+              <w:rPr>
+                <w:rFonts w:ascii="Aptos" w:hAnsi="Aptos"/>
+              </w:rPr>
+              <w:t>yes</w:t>
+            </w:r>
+          </w:p>
+        </w:tc>
+        <w:tc>
+          <w:tcPr>
+            <w:tcW w:w="1243" w:type="dxa"/>
+          </w:tcPr>
+          <w:p>
+            <w:pPr>
+              <w:rPr>
+                <w:rFonts w:ascii="Aptos" w:hAnsi="Aptos"/>
+              </w:rPr>
+            </w:pPr>
+            <w:r>
+              <w:rPr>
+                <w:rFonts w:ascii="Aptos" w:hAnsi="Aptos"/>
+              </w:rPr>
+              <w:t>0</w:t>
+            </w:r>
+          </w:p>
+        </w:tc>
+        <w:tc>
+          <w:tcPr>
+            <w:tcW w:w="1353" w:type="dxa"/>
+            <w:vMerge/>
           </w:tcPr>
           <w:p>
             <w:pPr>
@@ -2657,32 +3115,7 @@
         </w:tc>
         <w:tc>
           <w:tcPr>
-            <w:tcW w:w="1276" w:type="dxa"/>
-          </w:tcPr>
-          <w:p>
-            <w:pPr>
-              <w:rPr>
-                <w:rFonts w:ascii="Aptos" w:hAnsi="Aptos"/>
-              </w:rPr>
-            </w:pPr>
-          </w:p>
-        </w:tc>
-        <w:tc>
-          <w:tcPr>
-            <w:tcW w:w="1297" w:type="dxa"/>
-            <w:vMerge/>
-          </w:tcPr>
-          <w:p>
-            <w:pPr>
-              <w:rPr>
-                <w:rFonts w:ascii="Aptos" w:hAnsi="Aptos"/>
-              </w:rPr>
-            </w:pPr>
-          </w:p>
-        </w:tc>
-        <w:tc>
-          <w:tcPr>
-            <w:tcW w:w="4190" w:type="dxa"/>
+            <w:tcW w:w="3950" w:type="dxa"/>
             <w:vMerge/>
           </w:tcPr>
           <w:p>
@@ -2697,78 +3130,7 @@
       <w:tr>
         <w:tc>
           <w:tcPr>
-            <w:tcW w:w="664" w:type="dxa"/>
-          </w:tcPr>
-          <w:p>
-            <w:pPr>
-              <w:jc w:val="center"/>
-              <w:rPr>
-                <w:rFonts w:ascii="Aptos" w:hAnsi="Aptos"/>
-              </w:rPr>
-            </w:pPr>
-            <w:r>
-              <w:rPr>
-                <w:rFonts w:ascii="Aptos" w:hAnsi="Aptos"/>
-              </w:rPr>
-              <w:t>3</w:t>
-            </w:r>
-          </w:p>
-        </w:tc>
-        <w:tc>
-          <w:tcPr>
-            <w:tcW w:w="1429" w:type="dxa"/>
-          </w:tcPr>
-          <w:p>
-            <w:pPr>
-              <w:rPr>
-                <w:rFonts w:ascii="Aptos" w:hAnsi="Aptos"/>
-              </w:rPr>
-            </w:pPr>
-          </w:p>
-        </w:tc>
-        <w:tc>
-          <w:tcPr>
-            <w:tcW w:w="1276" w:type="dxa"/>
-          </w:tcPr>
-          <w:p>
-            <w:pPr>
-              <w:rPr>
-                <w:rFonts w:ascii="Aptos" w:hAnsi="Aptos"/>
-              </w:rPr>
-            </w:pPr>
-          </w:p>
-        </w:tc>
-        <w:tc>
-          <w:tcPr>
-            <w:tcW w:w="1297" w:type="dxa"/>
-            <w:vMerge/>
-          </w:tcPr>
-          <w:p>
-            <w:pPr>
-              <w:rPr>
-                <w:rFonts w:ascii="Aptos" w:hAnsi="Aptos"/>
-              </w:rPr>
-            </w:pPr>
-          </w:p>
-        </w:tc>
-        <w:tc>
-          <w:tcPr>
-            <w:tcW w:w="4190" w:type="dxa"/>
-            <w:vMerge/>
-          </w:tcPr>
-          <w:p>
-            <w:pPr>
-              <w:rPr>
-                <w:rFonts w:ascii="Aptos" w:hAnsi="Aptos"/>
-              </w:rPr>
-            </w:pPr>
-          </w:p>
-        </w:tc>
-      </w:tr>
-      <w:tr>
-        <w:tc>
-          <w:tcPr>
-            <w:tcW w:w="664" w:type="dxa"/>
+            <w:tcW w:w="663" w:type="dxa"/>
           </w:tcPr>
           <w:p>
             <w:pPr>
@@ -2787,7 +3149,44 @@
         </w:tc>
         <w:tc>
           <w:tcPr>
-            <w:tcW w:w="1429" w:type="dxa"/>
+            <w:tcW w:w="1421" w:type="dxa"/>
+          </w:tcPr>
+          <w:p>
+            <w:pPr>
+              <w:rPr>
+                <w:rFonts w:ascii="Aptos" w:hAnsi="Aptos"/>
+              </w:rPr>
+            </w:pPr>
+            <w:r>
+              <w:rPr>
+                <w:rFonts w:ascii="Aptos" w:hAnsi="Aptos"/>
+              </w:rPr>
+              <w:t>yes</w:t>
+            </w:r>
+          </w:p>
+        </w:tc>
+        <w:tc>
+          <w:tcPr>
+            <w:tcW w:w="1243" w:type="dxa"/>
+          </w:tcPr>
+          <w:p>
+            <w:pPr>
+              <w:rPr>
+                <w:rFonts w:ascii="Aptos" w:hAnsi="Aptos"/>
+              </w:rPr>
+            </w:pPr>
+            <w:r>
+              <w:rPr>
+                <w:rFonts w:ascii="Aptos" w:hAnsi="Aptos"/>
+              </w:rPr>
+              <w:t>0</w:t>
+            </w:r>
+          </w:p>
+        </w:tc>
+        <w:tc>
+          <w:tcPr>
+            <w:tcW w:w="1353" w:type="dxa"/>
+            <w:vMerge/>
           </w:tcPr>
           <w:p>
             <w:pPr>
@@ -2799,32 +3198,7 @@
         </w:tc>
         <w:tc>
           <w:tcPr>
-            <w:tcW w:w="1276" w:type="dxa"/>
-          </w:tcPr>
-          <w:p>
-            <w:pPr>
-              <w:rPr>
-                <w:rFonts w:ascii="Aptos" w:hAnsi="Aptos"/>
-              </w:rPr>
-            </w:pPr>
-          </w:p>
-        </w:tc>
-        <w:tc>
-          <w:tcPr>
-            <w:tcW w:w="1297" w:type="dxa"/>
-            <w:vMerge/>
-          </w:tcPr>
-          <w:p>
-            <w:pPr>
-              <w:rPr>
-                <w:rFonts w:ascii="Aptos" w:hAnsi="Aptos"/>
-              </w:rPr>
-            </w:pPr>
-          </w:p>
-        </w:tc>
-        <w:tc>
-          <w:tcPr>
-            <w:tcW w:w="4190" w:type="dxa"/>
+            <w:tcW w:w="3950" w:type="dxa"/>
             <w:vMerge/>
           </w:tcPr>
           <w:p>

</xml_diff>